<commit_message>
Added Finals SRS as well as meeting log
</commit_message>
<xml_diff>
--- a/Meeting Logs/Meeting Log 1-25-26 through 2-1-26.docx
+++ b/Meeting Logs/Meeting Log 1-25-26 through 2-1-26.docx
@@ -111,17 +111,8 @@
                 <w:sz w:val="22"/>
                 <w:szCs w:val="22"/>
               </w:rPr>
-              <w:t xml:space="preserve">      Gas </w:t>
+              <w:t xml:space="preserve">      Gas Guzzlerz</w:t>
             </w:r>
-            <w:proofErr w:type="spellStart"/>
-            <w:r>
-              <w:rPr>
-                <w:sz w:val="22"/>
-                <w:szCs w:val="22"/>
-              </w:rPr>
-              <w:t>Guzzlerz</w:t>
-            </w:r>
-            <w:proofErr w:type="spellEnd"/>
           </w:p>
         </w:tc>
         <w:tc>
@@ -526,6 +517,20 @@
                 <w:szCs w:val="22"/>
               </w:rPr>
             </w:pPr>
+            <w:r>
+              <w:rPr>
+                <w:sz w:val="22"/>
+                <w:szCs w:val="22"/>
+              </w:rPr>
+              <w:t>1/</w:t>
+            </w:r>
+            <w:r>
+              <w:rPr>
+                <w:sz w:val="22"/>
+                <w:szCs w:val="22"/>
+              </w:rPr>
+              <w:t>28/26</w:t>
+            </w:r>
           </w:p>
         </w:tc>
         <w:tc>
@@ -539,6 +544,13 @@
                 <w:szCs w:val="22"/>
               </w:rPr>
             </w:pPr>
+            <w:r>
+              <w:rPr>
+                <w:sz w:val="22"/>
+                <w:szCs w:val="22"/>
+              </w:rPr>
+              <w:t>4:00</w:t>
+            </w:r>
           </w:p>
         </w:tc>
         <w:tc>
@@ -552,6 +564,13 @@
                 <w:szCs w:val="22"/>
               </w:rPr>
             </w:pPr>
+            <w:r>
+              <w:rPr>
+                <w:sz w:val="22"/>
+                <w:szCs w:val="22"/>
+              </w:rPr>
+              <w:t>Nathan Kyler Eric</w:t>
+            </w:r>
           </w:p>
         </w:tc>
       </w:tr>
@@ -594,6 +613,13 @@
                 <w:szCs w:val="22"/>
               </w:rPr>
             </w:pPr>
+            <w:r>
+              <w:rPr>
+                <w:sz w:val="22"/>
+                <w:szCs w:val="22"/>
+              </w:rPr>
+              <w:t>1/29/26</w:t>
+            </w:r>
           </w:p>
         </w:tc>
         <w:tc>
@@ -607,6 +633,13 @@
                 <w:szCs w:val="22"/>
               </w:rPr>
             </w:pPr>
+            <w:r>
+              <w:rPr>
+                <w:sz w:val="22"/>
+                <w:szCs w:val="22"/>
+              </w:rPr>
+              <w:t>7:00</w:t>
+            </w:r>
           </w:p>
         </w:tc>
         <w:tc>
@@ -620,6 +653,13 @@
                 <w:szCs w:val="22"/>
               </w:rPr>
             </w:pPr>
+            <w:r>
+              <w:rPr>
+                <w:sz w:val="22"/>
+                <w:szCs w:val="22"/>
+              </w:rPr>
+              <w:t>Nathan Kyler Eric</w:t>
+            </w:r>
           </w:p>
         </w:tc>
       </w:tr>
@@ -784,8 +824,6 @@
     <w:p>
       <w:pPr>
         <w:rPr>
-          <w:b/>
-          <w:bCs/>
           <w:sz w:val="22"/>
           <w:szCs w:val="22"/>
         </w:rPr>
@@ -799,12 +837,31 @@
         </w:rPr>
         <w:t>Meeting 2:</w:t>
       </w:r>
-    </w:p>
-    <w:p>
-      <w:pPr>
-        <w:rPr>
-          <w:b/>
-          <w:bCs/>
+      <w:r>
+        <w:rPr>
+          <w:sz w:val="22"/>
+          <w:szCs w:val="22"/>
+        </w:rPr>
+        <w:t xml:space="preserve"> We went ahead and started working on a rough UML diagram which later learned is </w:t>
+      </w:r>
+      <w:r>
+        <w:rPr>
+          <w:sz w:val="22"/>
+          <w:szCs w:val="22"/>
+        </w:rPr>
+        <w:t>a</w:t>
+      </w:r>
+      <w:r>
+        <w:rPr>
+          <w:sz w:val="22"/>
+          <w:szCs w:val="22"/>
+        </w:rPr>
+        <w:t xml:space="preserve"> class diagram. </w:t>
+      </w:r>
+    </w:p>
+    <w:p>
+      <w:pPr>
+        <w:rPr>
           <w:sz w:val="22"/>
           <w:szCs w:val="22"/>
         </w:rPr>
@@ -817,6 +874,36 @@
           <w:szCs w:val="22"/>
         </w:rPr>
         <w:t>Meeting 3:</w:t>
+      </w:r>
+      <w:r>
+        <w:rPr>
+          <w:b/>
+          <w:bCs/>
+          <w:sz w:val="22"/>
+          <w:szCs w:val="22"/>
+        </w:rPr>
+        <w:t xml:space="preserve"> </w:t>
+      </w:r>
+      <w:r>
+        <w:rPr>
+          <w:sz w:val="22"/>
+          <w:szCs w:val="22"/>
+        </w:rPr>
+        <w:t xml:space="preserve">We finalized the </w:t>
+      </w:r>
+      <w:r>
+        <w:rPr>
+          <w:sz w:val="22"/>
+          <w:szCs w:val="22"/>
+        </w:rPr>
+        <w:t xml:space="preserve">SRS and </w:t>
+      </w:r>
+      <w:r>
+        <w:rPr>
+          <w:sz w:val="22"/>
+          <w:szCs w:val="22"/>
+        </w:rPr>
+        <w:t>went ahead and started exploring he different diagrams</w:t>
       </w:r>
     </w:p>
     <w:p>
@@ -898,8 +985,6 @@
     <w:p>
       <w:pPr>
         <w:rPr>
-          <w:b/>
-          <w:bCs/>
           <w:sz w:val="22"/>
           <w:szCs w:val="22"/>
         </w:rPr>
@@ -913,12 +998,33 @@
         </w:rPr>
         <w:t>Meeting 2:</w:t>
       </w:r>
-    </w:p>
-    <w:p>
-      <w:pPr>
-        <w:rPr>
-          <w:b/>
-          <w:bCs/>
+      <w:r>
+        <w:rPr>
+          <w:b/>
+          <w:bCs/>
+          <w:sz w:val="22"/>
+          <w:szCs w:val="22"/>
+        </w:rPr>
+        <w:t xml:space="preserve"> </w:t>
+      </w:r>
+      <w:r>
+        <w:rPr>
+          <w:sz w:val="22"/>
+          <w:szCs w:val="22"/>
+        </w:rPr>
+        <w:t>Understanding what diagrams are needed and what th</w:t>
+      </w:r>
+      <w:r>
+        <w:rPr>
+          <w:sz w:val="22"/>
+          <w:szCs w:val="22"/>
+        </w:rPr>
+        <w:t xml:space="preserve">e requirements are </w:t>
+      </w:r>
+    </w:p>
+    <w:p>
+      <w:pPr>
+        <w:rPr>
           <w:sz w:val="22"/>
           <w:szCs w:val="22"/>
         </w:rPr>
@@ -931,6 +1037,22 @@
           <w:szCs w:val="22"/>
         </w:rPr>
         <w:t>Meeting 3:</w:t>
+      </w:r>
+      <w:r>
+        <w:rPr>
+          <w:b/>
+          <w:bCs/>
+          <w:sz w:val="22"/>
+          <w:szCs w:val="22"/>
+        </w:rPr>
+        <w:t xml:space="preserve"> </w:t>
+      </w:r>
+      <w:r>
+        <w:rPr>
+          <w:sz w:val="22"/>
+          <w:szCs w:val="22"/>
+        </w:rPr>
+        <w:t xml:space="preserve">For this meeting most was cleared up during class last meeting. </w:t>
       </w:r>
     </w:p>
     <w:p>
@@ -1028,12 +1150,26 @@
         </w:rPr>
         <w:t>Meeting 2:</w:t>
       </w:r>
-    </w:p>
-    <w:p>
-      <w:pPr>
-        <w:rPr>
-          <w:b/>
-          <w:bCs/>
+      <w:r>
+        <w:rPr>
+          <w:b/>
+          <w:bCs/>
+          <w:sz w:val="22"/>
+          <w:szCs w:val="22"/>
+        </w:rPr>
+        <w:t xml:space="preserve"> </w:t>
+      </w:r>
+      <w:r>
+        <w:rPr>
+          <w:sz w:val="22"/>
+          <w:szCs w:val="22"/>
+        </w:rPr>
+        <w:t>Work on completing the SRS as well as look more into the different diagrams</w:t>
+      </w:r>
+    </w:p>
+    <w:p>
+      <w:pPr>
+        <w:rPr>
           <w:sz w:val="22"/>
           <w:szCs w:val="22"/>
         </w:rPr>
@@ -1046,6 +1182,22 @@
           <w:szCs w:val="22"/>
         </w:rPr>
         <w:t>Meeting 3:</w:t>
+      </w:r>
+      <w:r>
+        <w:rPr>
+          <w:b/>
+          <w:bCs/>
+          <w:sz w:val="22"/>
+          <w:szCs w:val="22"/>
+        </w:rPr>
+        <w:t xml:space="preserve"> </w:t>
+      </w:r>
+      <w:r>
+        <w:rPr>
+          <w:sz w:val="22"/>
+          <w:szCs w:val="22"/>
+        </w:rPr>
+        <w:t xml:space="preserve">We are going to start working on the assigned diagrams that we have chosen. </w:t>
       </w:r>
     </w:p>
     <w:p>
@@ -1227,6 +1379,126 @@
           <w:szCs w:val="22"/>
         </w:rPr>
       </w:pPr>
+      <w:r>
+        <w:rPr>
+          <w:b/>
+          <w:bCs/>
+          <w:sz w:val="22"/>
+          <w:szCs w:val="22"/>
+        </w:rPr>
+        <w:t>Eric Parra</w:t>
+      </w:r>
+      <w:r>
+        <w:rPr>
+          <w:b/>
+          <w:bCs/>
+          <w:sz w:val="22"/>
+          <w:szCs w:val="22"/>
+        </w:rPr>
+        <w:t>l</w:t>
+      </w:r>
+      <w:r>
+        <w:rPr>
+          <w:b/>
+          <w:bCs/>
+          <w:sz w:val="22"/>
+          <w:szCs w:val="22"/>
+        </w:rPr>
+        <w:t xml:space="preserve">- Class Diagram </w:t>
+      </w:r>
+    </w:p>
+    <w:p>
+      <w:pPr>
+        <w:rPr>
+          <w:b/>
+          <w:bCs/>
+          <w:sz w:val="22"/>
+          <w:szCs w:val="22"/>
+        </w:rPr>
+      </w:pPr>
+      <w:r>
+        <w:rPr>
+          <w:b/>
+          <w:bCs/>
+          <w:sz w:val="22"/>
+          <w:szCs w:val="22"/>
+        </w:rPr>
+        <w:t>Nathan Car</w:t>
+      </w:r>
+      <w:r>
+        <w:rPr>
+          <w:b/>
+          <w:bCs/>
+          <w:sz w:val="22"/>
+          <w:szCs w:val="22"/>
+        </w:rPr>
+        <w:t>relson</w:t>
+      </w:r>
+      <w:r>
+        <w:rPr>
+          <w:b/>
+          <w:bCs/>
+          <w:sz w:val="22"/>
+          <w:szCs w:val="22"/>
+        </w:rPr>
+        <w:t>- Use Case Diagram</w:t>
+      </w:r>
+    </w:p>
+    <w:p>
+      <w:pPr>
+        <w:rPr>
+          <w:b/>
+          <w:bCs/>
+          <w:sz w:val="22"/>
+          <w:szCs w:val="22"/>
+        </w:rPr>
+      </w:pPr>
+      <w:r>
+        <w:rPr>
+          <w:b/>
+          <w:bCs/>
+          <w:sz w:val="22"/>
+          <w:szCs w:val="22"/>
+        </w:rPr>
+        <w:t>Kyler Cressal</w:t>
+      </w:r>
+      <w:r>
+        <w:rPr>
+          <w:b/>
+          <w:bCs/>
+          <w:sz w:val="22"/>
+          <w:szCs w:val="22"/>
+        </w:rPr>
+        <w:t>l- ERM Diagram</w:t>
+      </w:r>
+    </w:p>
+    <w:p>
+      <w:pPr>
+        <w:rPr>
+          <w:b/>
+          <w:bCs/>
+          <w:sz w:val="22"/>
+          <w:szCs w:val="22"/>
+        </w:rPr>
+      </w:pPr>
+      <w:r>
+        <w:rPr>
+          <w:b/>
+          <w:bCs/>
+          <w:sz w:val="22"/>
+          <w:szCs w:val="22"/>
+        </w:rPr>
+        <w:t>Thomas Ross</w:t>
+      </w:r>
+      <w:r>
+        <w:rPr>
+          <w:b/>
+          <w:bCs/>
+          <w:sz w:val="22"/>
+          <w:szCs w:val="22"/>
+        </w:rPr>
+        <w:t xml:space="preserve">- Architecture Diagram </w:t>
+      </w:r>
     </w:p>
     <w:p>
       <w:pPr>
@@ -1254,7 +1526,21 @@
           <w:sz w:val="16"/>
           <w:szCs w:val="16"/>
         </w:rPr>
-        <w:t>Since this is a small project, you may not have formal ownership roles. Instead, list the team member assigned to each action item. In larger projects, ownership and assignment are typically separate roles.</w:t>
+        <w:t xml:space="preserve">Since this is a small project, you may not have formal ownership roles. Instead, list the team </w:t>
+      </w:r>
+      <w:r>
+        <w:rPr>
+          <w:sz w:val="16"/>
+          <w:szCs w:val="16"/>
+        </w:rPr>
+        <w:t>members</w:t>
+      </w:r>
+      <w:r>
+        <w:rPr>
+          <w:sz w:val="16"/>
+          <w:szCs w:val="16"/>
+        </w:rPr>
+        <w:t xml:space="preserve"> assigned to each action item. In larger projects, ownership and assignment are typically separate roles.</w:t>
       </w:r>
     </w:p>
     <w:tbl>
@@ -1368,6 +1654,15 @@
           <w:szCs w:val="22"/>
         </w:rPr>
       </w:pPr>
+      <w:r>
+        <w:rPr>
+          <w:b/>
+          <w:bCs/>
+          <w:sz w:val="22"/>
+          <w:szCs w:val="22"/>
+        </w:rPr>
+        <w:t>2/3/26</w:t>
+      </w:r>
     </w:p>
     <w:p>
       <w:pPr>
@@ -1489,6 +1784,7 @@
           <w:sz w:val="22"/>
           <w:szCs w:val="22"/>
         </w:rPr>
+        <w:lastRenderedPageBreak/>
         <w:t>Team Lead Name:</w:t>
       </w:r>
       <w:r>
@@ -1843,21 +2139,12 @@
         <w:szCs w:val="16"/>
       </w:rPr>
     </w:pPr>
-    <w:proofErr w:type="spellStart"/>
     <w:r>
       <w:rPr>
         <w:sz w:val="16"/>
         <w:szCs w:val="16"/>
       </w:rPr>
-      <w:t>ioverflowSolutions</w:t>
-    </w:r>
-    <w:proofErr w:type="spellEnd"/>
-    <w:r>
-      <w:rPr>
-        <w:sz w:val="16"/>
-        <w:szCs w:val="16"/>
-      </w:rPr>
-      <w:t xml:space="preserve"> copyright</w:t>
+      <w:t>ioverflowSolutions copyright</w:t>
     </w:r>
   </w:p>
 </w:ftr>

</xml_diff>

<commit_message>
Meeting 4 with thomas
</commit_message>
<xml_diff>
--- a/Meeting Logs/Meeting Log 1-25-26 through 2-1-26.docx
+++ b/Meeting Logs/Meeting Log 1-25-26 through 2-1-26.docx
@@ -15,7 +15,7 @@
         <w:tblLook w:val="04A0" w:firstRow="1" w:lastRow="0" w:firstColumn="1" w:lastColumn="0" w:noHBand="0" w:noVBand="1"/>
       </w:tblPr>
       <w:tblGrid>
-        <w:gridCol w:w="2799"/>
+        <w:gridCol w:w="2738"/>
         <w:gridCol w:w="81"/>
       </w:tblGrid>
       <w:tr>
@@ -48,8 +48,6 @@
             </w:r>
             <w:r>
               <w:rPr>
-                <w:b/>
-                <w:bCs/>
                 <w:sz w:val="22"/>
                 <w:szCs w:val="22"/>
               </w:rPr>
@@ -111,7 +109,14 @@
                 <w:sz w:val="22"/>
                 <w:szCs w:val="22"/>
               </w:rPr>
-              <w:t xml:space="preserve">      Gas Guzzlerz</w:t>
+              <w:t xml:space="preserve">      Gas </w:t>
+            </w:r>
+            <w:r>
+              <w:rPr>
+                <w:sz w:val="22"/>
+                <w:szCs w:val="22"/>
+              </w:rPr>
+              <w:t>Guzzler</w:t>
             </w:r>
           </w:p>
         </w:tc>
@@ -695,6 +700,13 @@
                 <w:szCs w:val="22"/>
               </w:rPr>
             </w:pPr>
+            <w:r>
+              <w:rPr>
+                <w:sz w:val="22"/>
+                <w:szCs w:val="22"/>
+              </w:rPr>
+              <w:t>1/30/26</w:t>
+            </w:r>
           </w:p>
         </w:tc>
         <w:tc>
@@ -708,6 +720,13 @@
                 <w:szCs w:val="22"/>
               </w:rPr>
             </w:pPr>
+            <w:r>
+              <w:rPr>
+                <w:sz w:val="22"/>
+                <w:szCs w:val="22"/>
+              </w:rPr>
+              <w:t>7:00</w:t>
+            </w:r>
           </w:p>
         </w:tc>
         <w:tc>
@@ -721,6 +740,81 @@
                 <w:szCs w:val="22"/>
               </w:rPr>
             </w:pPr>
+            <w:r>
+              <w:rPr>
+                <w:sz w:val="22"/>
+                <w:szCs w:val="22"/>
+              </w:rPr>
+              <w:t xml:space="preserve">Eric Thomas </w:t>
+            </w:r>
+          </w:p>
+        </w:tc>
+      </w:tr>
+      <w:tr>
+        <w:tc>
+          <w:tcPr>
+            <w:tcW w:w="1345" w:type="dxa"/>
+          </w:tcPr>
+          <w:p>
+            <w:pPr>
+              <w:rPr>
+                <w:sz w:val="22"/>
+                <w:szCs w:val="22"/>
+              </w:rPr>
+            </w:pPr>
+            <w:r>
+              <w:rPr>
+                <w:sz w:val="22"/>
+                <w:szCs w:val="22"/>
+              </w:rPr>
+              <w:t>5</w:t>
+            </w:r>
+            <w:r>
+              <w:rPr>
+                <w:sz w:val="22"/>
+                <w:szCs w:val="22"/>
+              </w:rPr>
+              <w:t xml:space="preserve"> Zoom</w:t>
+            </w:r>
+          </w:p>
+        </w:tc>
+        <w:tc>
+          <w:tcPr>
+            <w:tcW w:w="1890" w:type="dxa"/>
+          </w:tcPr>
+          <w:p>
+            <w:pPr>
+              <w:rPr>
+                <w:sz w:val="22"/>
+                <w:szCs w:val="22"/>
+              </w:rPr>
+            </w:pPr>
+          </w:p>
+        </w:tc>
+        <w:tc>
+          <w:tcPr>
+            <w:tcW w:w="1980" w:type="dxa"/>
+          </w:tcPr>
+          <w:p>
+            <w:pPr>
+              <w:rPr>
+                <w:sz w:val="22"/>
+                <w:szCs w:val="22"/>
+              </w:rPr>
+            </w:pPr>
+          </w:p>
+        </w:tc>
+        <w:tc>
+          <w:tcPr>
+            <w:tcW w:w="5040" w:type="dxa"/>
+          </w:tcPr>
+          <w:p>
+            <w:pPr>
+              <w:rPr>
+                <w:sz w:val="22"/>
+                <w:szCs w:val="22"/>
+              </w:rPr>
+            </w:pPr>
           </w:p>
         </w:tc>
       </w:tr>
@@ -903,14 +997,26 @@
           <w:sz w:val="22"/>
           <w:szCs w:val="22"/>
         </w:rPr>
-        <w:t>went ahead and started exploring he different diagrams</w:t>
-      </w:r>
-    </w:p>
-    <w:p>
-      <w:pPr>
-        <w:rPr>
-          <w:b/>
-          <w:bCs/>
+        <w:t xml:space="preserve">went ahead and started exploring </w:t>
+      </w:r>
+      <w:r>
+        <w:rPr>
+          <w:sz w:val="22"/>
+          <w:szCs w:val="22"/>
+        </w:rPr>
+        <w:t>the</w:t>
+      </w:r>
+      <w:r>
+        <w:rPr>
+          <w:sz w:val="22"/>
+          <w:szCs w:val="22"/>
+        </w:rPr>
+        <w:t xml:space="preserve"> different diagrams</w:t>
+      </w:r>
+    </w:p>
+    <w:p>
+      <w:pPr>
+        <w:rPr>
           <w:sz w:val="22"/>
           <w:szCs w:val="22"/>
         </w:rPr>
@@ -923,6 +1029,43 @@
           <w:szCs w:val="22"/>
         </w:rPr>
         <w:t xml:space="preserve">Meeting 4: </w:t>
+      </w:r>
+      <w:r>
+        <w:rPr>
+          <w:sz w:val="22"/>
+          <w:szCs w:val="22"/>
+        </w:rPr>
+        <w:t xml:space="preserve">Showed examples of what is needed for the different diagrams and as team </w:t>
+      </w:r>
+      <w:proofErr w:type="gramStart"/>
+      <w:r>
+        <w:rPr>
+          <w:sz w:val="22"/>
+          <w:szCs w:val="22"/>
+        </w:rPr>
+        <w:t>lead</w:t>
+      </w:r>
+      <w:proofErr w:type="gramEnd"/>
+      <w:r>
+        <w:rPr>
+          <w:sz w:val="22"/>
+          <w:szCs w:val="22"/>
+        </w:rPr>
+        <w:t xml:space="preserve"> </w:t>
+      </w:r>
+      <w:r>
+        <w:rPr>
+          <w:sz w:val="22"/>
+          <w:szCs w:val="22"/>
+        </w:rPr>
+        <w:t>explained it</w:t>
+      </w:r>
+      <w:r>
+        <w:rPr>
+          <w:sz w:val="22"/>
+          <w:szCs w:val="22"/>
+        </w:rPr>
+        <w:t xml:space="preserve"> to the best of my capabilities</w:t>
       </w:r>
     </w:p>
     <w:p>
@@ -1058,37 +1201,56 @@
     <w:p>
       <w:pPr>
         <w:rPr>
-          <w:b/>
-          <w:bCs/>
-          <w:sz w:val="22"/>
-          <w:szCs w:val="22"/>
-        </w:rPr>
-      </w:pPr>
-      <w:r>
-        <w:rPr>
-          <w:b/>
-          <w:bCs/>
-          <w:sz w:val="22"/>
-          <w:szCs w:val="22"/>
-        </w:rPr>
+          <w:sz w:val="22"/>
+          <w:szCs w:val="22"/>
+        </w:rPr>
+      </w:pPr>
+      <w:r>
+        <w:rPr>
+          <w:b/>
+          <w:bCs/>
+          <w:sz w:val="22"/>
+          <w:szCs w:val="22"/>
+        </w:rPr>
+        <w:lastRenderedPageBreak/>
         <w:t xml:space="preserve">Meeting 4: </w:t>
       </w:r>
-    </w:p>
-    <w:p>
-      <w:pPr>
-        <w:rPr>
-          <w:sz w:val="22"/>
-          <w:szCs w:val="22"/>
-        </w:rPr>
-      </w:pPr>
-      <w:r>
-        <w:rPr>
-          <w:b/>
-          <w:bCs/>
-          <w:sz w:val="22"/>
-          <w:szCs w:val="22"/>
-        </w:rPr>
-        <w:lastRenderedPageBreak/>
+      <w:r>
+        <w:rPr>
+          <w:sz w:val="22"/>
+          <w:szCs w:val="22"/>
+        </w:rPr>
+        <w:t xml:space="preserve">Finding Great examples to share </w:t>
+      </w:r>
+      <w:r>
+        <w:rPr>
+          <w:sz w:val="22"/>
+          <w:szCs w:val="22"/>
+        </w:rPr>
+        <w:t>with</w:t>
+      </w:r>
+      <w:r>
+        <w:rPr>
+          <w:sz w:val="22"/>
+          <w:szCs w:val="22"/>
+        </w:rPr>
+        <w:t xml:space="preserve"> the whole team </w:t>
+      </w:r>
+    </w:p>
+    <w:p>
+      <w:pPr>
+        <w:rPr>
+          <w:sz w:val="22"/>
+          <w:szCs w:val="22"/>
+        </w:rPr>
+      </w:pPr>
+      <w:r>
+        <w:rPr>
+          <w:b/>
+          <w:bCs/>
+          <w:sz w:val="22"/>
+          <w:szCs w:val="22"/>
+        </w:rPr>
         <w:t>3. What do you plan to accomplish by the next team meeting?</w:t>
       </w:r>
       <w:r>
@@ -1203,8 +1365,6 @@
     <w:p>
       <w:pPr>
         <w:rPr>
-          <w:b/>
-          <w:bCs/>
           <w:sz w:val="22"/>
           <w:szCs w:val="22"/>
         </w:rPr>
@@ -1217,6 +1377,13 @@
           <w:szCs w:val="22"/>
         </w:rPr>
         <w:t xml:space="preserve">Meeting 4: </w:t>
+      </w:r>
+      <w:r>
+        <w:rPr>
+          <w:sz w:val="22"/>
+          <w:szCs w:val="22"/>
+        </w:rPr>
+        <w:t xml:space="preserve">Same thing as the meeting before just start working on the assigned diagrams. </w:t>
       </w:r>
     </w:p>
     <w:p>
@@ -1763,6 +1930,7 @@
           <w:sz w:val="22"/>
           <w:szCs w:val="22"/>
         </w:rPr>
+        <w:lastRenderedPageBreak/>
         <w:t>Team Lead Acknowledgment</w:t>
       </w:r>
     </w:p>
@@ -1784,7 +1952,6 @@
           <w:sz w:val="22"/>
           <w:szCs w:val="22"/>
         </w:rPr>
-        <w:lastRenderedPageBreak/>
         <w:t>Team Lead Name:</w:t>
       </w:r>
       <w:r>
@@ -2139,12 +2306,21 @@
         <w:szCs w:val="16"/>
       </w:rPr>
     </w:pPr>
+    <w:proofErr w:type="spellStart"/>
     <w:r>
       <w:rPr>
         <w:sz w:val="16"/>
         <w:szCs w:val="16"/>
       </w:rPr>
-      <w:t>ioverflowSolutions copyright</w:t>
+      <w:t>ioverflowSolutions</w:t>
+    </w:r>
+    <w:proofErr w:type="spellEnd"/>
+    <w:r>
+      <w:rPr>
+        <w:sz w:val="16"/>
+        <w:szCs w:val="16"/>
+      </w:rPr>
+      <w:t xml:space="preserve"> copyright</w:t>
     </w:r>
   </w:p>
 </w:ftr>

</xml_diff>